<commit_message>
docs: item 57 clarifications from the owner — opening phrase and honorific editable per letter (@عبارة التعظيم), page size A4 default with A5 per letter; reference template converted to A4
Co-Authored-By: Claude Fable 5.1 <noreply@anthropic.com>
</commit_message>
<xml_diff>
--- a/docs/templates/correspondence/نموذج-المراسلة.docx
+++ b/docs/templates/correspondence/نموذج-المراسلة.docx
@@ -165,7 +165,7 @@
           <w:rFonts w:hint="cs"/>
           <w:rtl/>
         </w:rPr>
-        <w:t>السيد / @اسم رئيس المكتب                              الموقر</w:t>
+        <w:t>السيد / @اسم رئيس المكتب                              @عبارة التعظيم</w:t>
       </w:r>
     </w:p>
     <w:p>
@@ -616,7 +616,7 @@
     </w:p>
     <w:sectPr>
       <w:headerReference w:type="default" r:id="rId6"/>
-      <w:pgSz w:w="12240" w:h="15840"/>
+      <w:pgSz w:w="11906" w:h="16838"/>
       <w:pgMar w:top="1440" w:right="1800" w:bottom="1440" w:left="1800" w:header="720" w:footer="720" w:gutter="0"/>
       <w:cols w:space="720"/>
       <w:docGrid w:linePitch="360"/>

</xml_diff>

<commit_message>
docs: item 57 — owner ruling: fixed phrases (honorific, opening, closing, extras) stay literal in the Word template and are changed by editing the template itself; placeholders are data-only; reference template restored accordingly (A4)
Co-Authored-By: Claude Fable 5.1 <noreply@anthropic.com>
</commit_message>
<xml_diff>
--- a/docs/templates/correspondence/نموذج-المراسلة.docx
+++ b/docs/templates/correspondence/نموذج-المراسلة.docx
@@ -165,7 +165,7 @@
           <w:rFonts w:hint="cs"/>
           <w:rtl/>
         </w:rPr>
-        <w:t>السيد / @اسم رئيس المكتب                              @عبارة التعظيم</w:t>
+        <w:t>السيد / @اسم رئيس المكتب                              الموقر</w:t>
       </w:r>
     </w:p>
     <w:p>
@@ -310,7 +310,7 @@
           <w:rFonts w:hint="cs"/>
           <w:rtl/>
         </w:rPr>
-        <w:t>@مقدمة المراسلة</w:t>
+        <w:t>نهديكم أطيب التحيات ونرجو أن تنعموا بموفور الصحة والعافية .. وبعد</w:t>
       </w:r>
     </w:p>
     <w:p>

</xml_diff>

<commit_message>
docs: item 57 — the letterhead is fixed content of the template header too; placeholders reduced to the nine letter-data tokens
Co-Authored-By: Claude Fable 5.1 <noreply@anthropic.com>
</commit_message>
<xml_diff>
--- a/docs/templates/correspondence/نموذج-المراسلة.docx
+++ b/docs/templates/correspondence/نموذج-المراسلة.docx
@@ -747,7 +747,7 @@
                               <w:szCs w:val="62"/>
                               <w:rtl/>
                             </w:rPr>
-                            <w:t>@الترويسة</w:t>
+                            <w:t>الترويسة</w:t>
                           </w:r>
                         </w:p>
                       </w:txbxContent>
@@ -784,7 +784,7 @@
                         <w:szCs w:val="62"/>
                         <w:rtl/>
                       </w:rPr>
-                      <w:t>@الترويسة</w:t>
+                      <w:t>الترويسة</w:t>
                     </w:r>
                   </w:p>
                 </w:txbxContent>

</xml_diff>